<commit_message>
Document check_cld_asset_support discovery mode in README and How-To
.... Generated with [Cortex Code](https://docs.snowflake.com/en/user-guide/cortex-code/cortex-code)

Co-Authored-By: Cortex Code <noreply@snowflake.com>
</commit_message>
<xml_diff>
--- a/docs/SAP_BDC_Snowflake_MCP_How_To_Use.docx
+++ b/docs/SAP_BDC_Snowflake_MCP_How_To_Use.docx
@@ -630,7 +630,7 @@
           </w:tcPr>
           <w:p>
             <w:r>
-              <w:t>Flag object types unsupported for catalog-linked DBs.</w:t>
+              <w:t>List existing catalog-linked databases (call with no arguments), or scan a database and flag object types unsupported for CLD consumption.</w:t>
             </w:r>
           </w:p>
         </w:tc>
@@ -857,7 +857,7 @@
         <w:pStyle w:val="ListBullet"/>
       </w:pPr>
       <w:r>
-        <w:t>2. Check assets: run check_cld_asset_support / list_unsupported_share_assets on your database.</w:t>
+        <w:t>2. Check assets: run check_cld_asset_support with no arguments to list existing catalog-linked databases, then re-run with a database to flag unsupported object types; use list_unsupported_share_assets for share-back readiness.</w:t>
       </w:r>
     </w:p>
     <w:p>

</xml_diff>